<commit_message>
Matriz: para gestión de ubicaciones
</commit_message>
<xml_diff>
--- a/DOCUMENTACION/MATRIZ DE TRAZABILIDAD LUIS DIEGO MORALES.docx
+++ b/DOCUMENTACION/MATRIZ DE TRAZABILIDAD LUIS DIEGO MORALES.docx
@@ -22,15 +22,20 @@
         <w:tblLook w:val="04A0" w:firstRow="1" w:lastRow="0" w:firstColumn="1" w:lastColumn="0" w:noHBand="0" w:noVBand="1"/>
       </w:tblPr>
       <w:tblGrid>
-        <w:gridCol w:w="2207"/>
-        <w:gridCol w:w="2207"/>
-        <w:gridCol w:w="2207"/>
-        <w:gridCol w:w="2207"/>
+        <w:gridCol w:w="1412"/>
+        <w:gridCol w:w="353"/>
+        <w:gridCol w:w="1766"/>
+        <w:gridCol w:w="34"/>
+        <w:gridCol w:w="1731"/>
+        <w:gridCol w:w="204"/>
+        <w:gridCol w:w="1562"/>
+        <w:gridCol w:w="361"/>
+        <w:gridCol w:w="1405"/>
       </w:tblGrid>
       <w:tr>
         <w:tc>
           <w:tcPr>
-            <w:tcW w:w="2207" w:type="dxa"/>
+            <w:tcW w:w="1412" w:type="dxa"/>
           </w:tcPr>
           <w:p>
             <w:r>
@@ -40,47 +45,580 @@
         </w:tc>
         <w:tc>
           <w:tcPr>
-            <w:tcW w:w="2207" w:type="dxa"/>
-          </w:tcPr>
+            <w:tcW w:w="2153" w:type="dxa"/>
+            <w:gridSpan w:val="3"/>
+          </w:tcPr>
+          <w:p>
+            <w:r>
+              <w:t>FASE</w:t>
+            </w:r>
+          </w:p>
+        </w:tc>
+        <w:tc>
+          <w:tcPr>
+            <w:tcW w:w="1935" w:type="dxa"/>
+            <w:gridSpan w:val="2"/>
+          </w:tcPr>
+          <w:p>
+            <w:r>
+              <w:t>TAREAS</w:t>
+            </w:r>
+          </w:p>
+        </w:tc>
+        <w:tc>
+          <w:tcPr>
+            <w:tcW w:w="1923" w:type="dxa"/>
+            <w:gridSpan w:val="2"/>
+          </w:tcPr>
+          <w:p>
+            <w:r>
+              <w:t>ESTADO</w:t>
+            </w:r>
+          </w:p>
+        </w:tc>
+        <w:tc>
+          <w:tcPr>
+            <w:tcW w:w="1405" w:type="dxa"/>
+          </w:tcPr>
+          <w:p>
+            <w:r>
+              <w:t>FECHA O COMMIT</w:t>
+            </w:r>
+          </w:p>
+        </w:tc>
+      </w:tr>
+      <w:tr>
+        <w:tc>
+          <w:tcPr>
+            <w:tcW w:w="8828" w:type="dxa"/>
+            <w:gridSpan w:val="9"/>
+          </w:tcPr>
+          <w:p>
+            <w:r>
+              <w:t>GESTIÓN DE UBICACIONES</w:t>
+            </w:r>
+          </w:p>
+        </w:tc>
+      </w:tr>
+      <w:tr>
+        <w:tc>
+          <w:tcPr>
+            <w:tcW w:w="1412" w:type="dxa"/>
+          </w:tcPr>
+          <w:p>
+            <w:r>
+              <w:t>Rf-08</w:t>
+            </w:r>
+          </w:p>
+        </w:tc>
+        <w:tc>
+          <w:tcPr>
+            <w:tcW w:w="2153" w:type="dxa"/>
+            <w:gridSpan w:val="3"/>
+          </w:tcPr>
+          <w:p>
+            <w:pPr>
+              <w:pStyle w:val="Prrafodelista"/>
+              <w:numPr>
+                <w:ilvl w:val="0"/>
+                <w:numId w:val="1"/>
+              </w:numPr>
+            </w:pPr>
+            <w:r>
+              <w:t>Modelo conceptual</w:t>
+            </w:r>
+          </w:p>
+        </w:tc>
+        <w:tc>
+          <w:tcPr>
+            <w:tcW w:w="1935" w:type="dxa"/>
+            <w:gridSpan w:val="2"/>
+          </w:tcPr>
+          <w:p>
+            <w:r>
+              <w:t>Definir entidades para tabla ubicaciones: id_usuario….</w:t>
+            </w:r>
+          </w:p>
+        </w:tc>
+        <w:tc>
+          <w:tcPr>
+            <w:tcW w:w="1923" w:type="dxa"/>
+            <w:gridSpan w:val="2"/>
+          </w:tcPr>
+          <w:p>
+            <w:r>
+              <w:t>COMPLETADO</w:t>
+            </w:r>
+          </w:p>
+        </w:tc>
+        <w:tc>
+          <w:tcPr>
+            <w:tcW w:w="1405" w:type="dxa"/>
+          </w:tcPr>
+          <w:p>
+            <w:r>
+              <w:t>5/09/2026</w:t>
+            </w:r>
+          </w:p>
+        </w:tc>
+      </w:tr>
+      <w:tr>
+        <w:tc>
+          <w:tcPr>
+            <w:tcW w:w="1412" w:type="dxa"/>
+          </w:tcPr>
+          <w:p>
+            <w:r>
+              <w:t>RF_08</w:t>
+            </w:r>
+          </w:p>
+        </w:tc>
+        <w:tc>
+          <w:tcPr>
+            <w:tcW w:w="2153" w:type="dxa"/>
+            <w:gridSpan w:val="3"/>
+          </w:tcPr>
+          <w:p>
+            <w:pPr>
+              <w:pStyle w:val="Prrafodelista"/>
+              <w:numPr>
+                <w:ilvl w:val="0"/>
+                <w:numId w:val="1"/>
+              </w:numPr>
+            </w:pPr>
+            <w:r>
+              <w:t>Modelo lógico</w:t>
+            </w:r>
+          </w:p>
+        </w:tc>
+        <w:tc>
+          <w:tcPr>
+            <w:tcW w:w="1935" w:type="dxa"/>
+            <w:gridSpan w:val="2"/>
+          </w:tcPr>
+          <w:p>
+            <w:r>
+              <w:t>Tabla de ubicaciones con sus campos</w:t>
+            </w:r>
+          </w:p>
+        </w:tc>
+        <w:tc>
+          <w:tcPr>
+            <w:tcW w:w="1923" w:type="dxa"/>
+            <w:gridSpan w:val="2"/>
+          </w:tcPr>
+          <w:p>
+            <w:r>
+              <w:t>COMPLETADO</w:t>
+            </w:r>
+          </w:p>
+        </w:tc>
+        <w:tc>
+          <w:tcPr>
+            <w:tcW w:w="1405" w:type="dxa"/>
+          </w:tcPr>
+          <w:p>
+            <w:r>
+              <w:t>09/09/2026</w:t>
+            </w:r>
+          </w:p>
+        </w:tc>
+      </w:tr>
+      <w:tr>
+        <w:tc>
+          <w:tcPr>
+            <w:tcW w:w="1412" w:type="dxa"/>
+          </w:tcPr>
+          <w:p>
+            <w:r>
+              <w:t>RF-08</w:t>
+            </w:r>
+          </w:p>
+        </w:tc>
+        <w:tc>
+          <w:tcPr>
+            <w:tcW w:w="2153" w:type="dxa"/>
+            <w:gridSpan w:val="3"/>
+          </w:tcPr>
+          <w:p>
+            <w:pPr>
+              <w:pStyle w:val="Prrafodelista"/>
+              <w:numPr>
+                <w:ilvl w:val="0"/>
+                <w:numId w:val="1"/>
+              </w:numPr>
+            </w:pPr>
+            <w:r>
+              <w:t>Modelo físico en SQL</w:t>
+            </w:r>
+          </w:p>
+        </w:tc>
+        <w:tc>
+          <w:tcPr>
+            <w:tcW w:w="1935" w:type="dxa"/>
+            <w:gridSpan w:val="2"/>
+          </w:tcPr>
+          <w:p>
+            <w:r>
+              <w:t>CREATE TABLE ubicaciones….</w:t>
+            </w:r>
+          </w:p>
+        </w:tc>
+        <w:tc>
+          <w:tcPr>
+            <w:tcW w:w="1923" w:type="dxa"/>
+            <w:gridSpan w:val="2"/>
+          </w:tcPr>
+          <w:p>
+            <w:r>
+              <w:t>COMPLETADO</w:t>
+            </w:r>
+          </w:p>
+        </w:tc>
+        <w:tc>
+          <w:tcPr>
+            <w:tcW w:w="1405" w:type="dxa"/>
+          </w:tcPr>
+          <w:p>
+            <w:r>
+              <w:t>09/09/2026</w:t>
+            </w:r>
+          </w:p>
+        </w:tc>
+      </w:tr>
+      <w:tr>
+        <w:tc>
+          <w:tcPr>
+            <w:tcW w:w="1412" w:type="dxa"/>
+          </w:tcPr>
+          <w:p>
+            <w:r>
+              <w:t>RF-09</w:t>
+            </w:r>
+          </w:p>
+        </w:tc>
+        <w:tc>
+          <w:tcPr>
+            <w:tcW w:w="2153" w:type="dxa"/>
+            <w:gridSpan w:val="3"/>
+          </w:tcPr>
+          <w:p>
+            <w:pPr>
+              <w:pStyle w:val="Prrafodelista"/>
+              <w:numPr>
+                <w:ilvl w:val="0"/>
+                <w:numId w:val="2"/>
+              </w:numPr>
+            </w:pPr>
+            <w:r>
+              <w:t>Modelo conceptual</w:t>
+            </w:r>
+          </w:p>
+        </w:tc>
+        <w:tc>
+          <w:tcPr>
+            <w:tcW w:w="1935" w:type="dxa"/>
+            <w:gridSpan w:val="2"/>
+          </w:tcPr>
+          <w:p>
+            <w:r>
+              <w:t>Relación 1:N “tienen”</w:t>
+            </w:r>
+          </w:p>
+        </w:tc>
+        <w:tc>
+          <w:tcPr>
+            <w:tcW w:w="1923" w:type="dxa"/>
+            <w:gridSpan w:val="2"/>
+          </w:tcPr>
+          <w:p>
+            <w:r>
+              <w:t>COMPLETADO</w:t>
+            </w:r>
+          </w:p>
+        </w:tc>
+        <w:tc>
+          <w:tcPr>
+            <w:tcW w:w="1405" w:type="dxa"/>
+          </w:tcPr>
+          <w:p>
+            <w:r>
+              <w:t>5/09/2026</w:t>
+            </w:r>
+          </w:p>
+        </w:tc>
+      </w:tr>
+      <w:tr>
+        <w:tc>
+          <w:tcPr>
+            <w:tcW w:w="1412" w:type="dxa"/>
+          </w:tcPr>
+          <w:p>
+            <w:r>
+              <w:t>RF-09</w:t>
+            </w:r>
+          </w:p>
+        </w:tc>
+        <w:tc>
+          <w:tcPr>
+            <w:tcW w:w="2153" w:type="dxa"/>
+            <w:gridSpan w:val="3"/>
+          </w:tcPr>
+          <w:p>
+            <w:pPr>
+              <w:pStyle w:val="Prrafodelista"/>
+            </w:pPr>
+            <w:r>
+              <w:t>3. Modelo Físico</w:t>
+            </w:r>
+          </w:p>
+        </w:tc>
+        <w:tc>
+          <w:tcPr>
+            <w:tcW w:w="1935" w:type="dxa"/>
+            <w:gridSpan w:val="2"/>
+          </w:tcPr>
+          <w:p>
+            <w:r>
+              <w:t>ALTER TABLE eventos y el trigger de no traslape</w:t>
+            </w:r>
+          </w:p>
+        </w:tc>
+        <w:tc>
+          <w:tcPr>
+            <w:tcW w:w="1923" w:type="dxa"/>
+            <w:gridSpan w:val="2"/>
+          </w:tcPr>
+          <w:p>
+            <w:r>
+              <w:t>COMPLETADO</w:t>
+            </w:r>
+          </w:p>
+        </w:tc>
+        <w:tc>
+          <w:tcPr>
+            <w:tcW w:w="1405" w:type="dxa"/>
+          </w:tcPr>
+          <w:p>
+            <w:r>
+              <w:t>14/09/2026</w:t>
+            </w:r>
+          </w:p>
+        </w:tc>
+      </w:tr>
+      <w:tr>
+        <w:tc>
+          <w:tcPr>
+            <w:tcW w:w="1412" w:type="dxa"/>
+          </w:tcPr>
+          <w:p>
+            <w:r>
+              <w:t>RF-09</w:t>
+            </w:r>
+          </w:p>
+        </w:tc>
+        <w:tc>
+          <w:tcPr>
+            <w:tcW w:w="2153" w:type="dxa"/>
+            <w:gridSpan w:val="3"/>
+          </w:tcPr>
+          <w:p>
+            <w:r>
+              <w:t>4.Interfaz gráfica</w:t>
+            </w:r>
+          </w:p>
+        </w:tc>
+        <w:tc>
+          <w:tcPr>
+            <w:tcW w:w="1935" w:type="dxa"/>
+            <w:gridSpan w:val="2"/>
+          </w:tcPr>
+          <w:p>
+            <w:r>
+              <w:t>Aquí se selecciona la ubicación en GUI y confirmamos no-traslape</w:t>
+            </w:r>
+          </w:p>
+        </w:tc>
+        <w:tc>
+          <w:tcPr>
+            <w:tcW w:w="1923" w:type="dxa"/>
+            <w:gridSpan w:val="2"/>
+          </w:tcPr>
+          <w:p>
+            <w:r>
+              <w:t>COMPLETADO</w:t>
+            </w:r>
+          </w:p>
+        </w:tc>
+        <w:tc>
+          <w:tcPr>
+            <w:tcW w:w="1405" w:type="dxa"/>
+          </w:tcPr>
+          <w:p>
+            <w:r>
+              <w:t>14/09/2026</w:t>
+            </w:r>
+          </w:p>
+        </w:tc>
+      </w:tr>
+      <w:tr>
+        <w:tc>
+          <w:tcPr>
+            <w:tcW w:w="1412" w:type="dxa"/>
+          </w:tcPr>
+          <w:p>
+            <w:r>
+              <w:t>RF-10</w:t>
+            </w:r>
+          </w:p>
+        </w:tc>
+        <w:tc>
+          <w:tcPr>
+            <w:tcW w:w="2153" w:type="dxa"/>
+            <w:gridSpan w:val="3"/>
+          </w:tcPr>
+          <w:p>
+            <w:r>
+              <w:t xml:space="preserve">3.Modelo físico en SQL </w:t>
+            </w:r>
+          </w:p>
+        </w:tc>
+        <w:tc>
+          <w:tcPr>
+            <w:tcW w:w="1935" w:type="dxa"/>
+            <w:gridSpan w:val="2"/>
+          </w:tcPr>
+          <w:p>
+            <w:r>
+              <w:t>Vista para ocupación de ubicaciones</w:t>
+            </w:r>
+          </w:p>
+        </w:tc>
+        <w:tc>
+          <w:tcPr>
+            <w:tcW w:w="1923" w:type="dxa"/>
+            <w:gridSpan w:val="2"/>
+          </w:tcPr>
+          <w:p>
+            <w:r>
+              <w:t>COMPLETADO</w:t>
+            </w:r>
+          </w:p>
+        </w:tc>
+        <w:tc>
+          <w:tcPr>
+            <w:tcW w:w="1405" w:type="dxa"/>
+          </w:tcPr>
+          <w:p>
+            <w:r>
+              <w:t>13/09/2026</w:t>
+            </w:r>
+          </w:p>
+        </w:tc>
+      </w:tr>
+      <w:tr>
+        <w:tc>
+          <w:tcPr>
+            <w:tcW w:w="1412" w:type="dxa"/>
+          </w:tcPr>
+          <w:p>
+            <w:r>
+              <w:t>RF-10</w:t>
+            </w:r>
+          </w:p>
+        </w:tc>
+        <w:tc>
+          <w:tcPr>
+            <w:tcW w:w="2153" w:type="dxa"/>
+            <w:gridSpan w:val="3"/>
+          </w:tcPr>
+          <w:p>
+            <w:r>
+              <w:t>4.Interfaz gráfica</w:t>
+            </w:r>
+          </w:p>
+        </w:tc>
+        <w:tc>
+          <w:tcPr>
+            <w:tcW w:w="1935" w:type="dxa"/>
+            <w:gridSpan w:val="2"/>
+          </w:tcPr>
+          <w:p>
+            <w:r>
+              <w:t>Reportes solo de lectura de datos</w:t>
+            </w:r>
+          </w:p>
+        </w:tc>
+        <w:tc>
+          <w:tcPr>
+            <w:tcW w:w="1923" w:type="dxa"/>
+            <w:gridSpan w:val="2"/>
+          </w:tcPr>
+          <w:p>
+            <w:r>
+              <w:t>COMPLETADO</w:t>
+            </w:r>
+          </w:p>
+        </w:tc>
+        <w:tc>
+          <w:tcPr>
+            <w:tcW w:w="1405" w:type="dxa"/>
+          </w:tcPr>
+          <w:p>
+            <w:r>
+              <w:t>14/09/2026</w:t>
+            </w:r>
+          </w:p>
+        </w:tc>
+      </w:tr>
+      <w:tr>
+        <w:tc>
+          <w:tcPr>
+            <w:tcW w:w="8828" w:type="dxa"/>
+            <w:gridSpan w:val="9"/>
+          </w:tcPr>
+          <w:p>
+            <w:r>
+              <w:t>EVENTOS RECURRENTES</w:t>
+            </w:r>
+          </w:p>
           <w:p/>
         </w:tc>
-        <w:tc>
-          <w:tcPr>
-            <w:tcW w:w="2207" w:type="dxa"/>
+      </w:tr>
+      <w:tr>
+        <w:tc>
+          <w:tcPr>
+            <w:tcW w:w="1765" w:type="dxa"/>
+            <w:gridSpan w:val="2"/>
           </w:tcPr>
           <w:p/>
         </w:tc>
         <w:tc>
           <w:tcPr>
-            <w:tcW w:w="2207" w:type="dxa"/>
+            <w:tcW w:w="1766" w:type="dxa"/>
           </w:tcPr>
           <w:p/>
         </w:tc>
-      </w:tr>
-    </w:tbl>
-    <w:tbl>
-      <w:tblPr>
-        <w:tblStyle w:val="Tablaconcuadrcula"/>
-        <w:tblpPr w:leftFromText="141" w:rightFromText="141" w:vertAnchor="text" w:horzAnchor="margin" w:tblpY="-24"/>
-        <w:tblW w:w="0" w:type="auto"/>
-        <w:tblLook w:val="04A0" w:firstRow="1" w:lastRow="0" w:firstColumn="1" w:lastColumn="0" w:noHBand="0" w:noVBand="1"/>
-      </w:tblPr>
-      <w:tblGrid>
-        <w:gridCol w:w="8828"/>
-      </w:tblGrid>
-      <w:tr>
-        <w:trPr>
-          <w:trHeight w:val="699"/>
-        </w:trPr>
-        <w:tc>
-          <w:tcPr>
-            <w:tcW w:w="8828" w:type="dxa"/>
-          </w:tcPr>
-          <w:p>
-            <w:r>
-              <w:t>GESTION DE UBICACIONES</w:t>
-            </w:r>
-          </w:p>
+        <w:tc>
+          <w:tcPr>
+            <w:tcW w:w="1765" w:type="dxa"/>
+            <w:gridSpan w:val="2"/>
+          </w:tcPr>
+          <w:p/>
+        </w:tc>
+        <w:tc>
+          <w:tcPr>
+            <w:tcW w:w="1766" w:type="dxa"/>
+            <w:gridSpan w:val="2"/>
+          </w:tcPr>
+          <w:p/>
+        </w:tc>
+        <w:tc>
+          <w:tcPr>
+            <w:tcW w:w="1766" w:type="dxa"/>
+            <w:gridSpan w:val="2"/>
+          </w:tcPr>
+          <w:p/>
         </w:tc>
       </w:tr>
     </w:tbl>
@@ -93,6 +631,195 @@
     </w:sectPr>
   </w:body>
 </w:document>
+</file>
+
+<file path=word/numbering.xml><?xml version="1.0" encoding="utf-8"?>
+<w:numbering xmlns:wpc="http://schemas.microsoft.com/office/word/2010/wordprocessingCanvas" xmlns:cx="http://schemas.microsoft.com/office/drawing/2014/chartex" xmlns:cx1="http://schemas.microsoft.com/office/drawing/2015/9/8/chartex" xmlns:cx2="http://schemas.microsoft.com/office/drawing/2015/10/21/chartex" xmlns:cx3="http://schemas.microsoft.com/office/drawing/2016/5/9/chartex" xmlns:cx4="http://schemas.microsoft.com/office/drawing/2016/5/10/chartex" xmlns:cx5="http://schemas.microsoft.com/office/drawing/2016/5/11/chartex" xmlns:cx6="http://schemas.microsoft.com/office/drawing/2016/5/12/chartex" xmlns:cx7="http://schemas.microsoft.com/office/drawing/2016/5/13/chartex" xmlns:cx8="http://schemas.microsoft.com/office/drawing/2016/5/14/chartex" xmlns:mc="http://schemas.openxmlformats.org/markup-compatibility/2006" xmlns:aink="http://schemas.microsoft.com/office/drawing/2016/ink" xmlns:am3d="http://schemas.microsoft.com/office/drawing/2017/model3d" xmlns:o="urn:schemas-microsoft-com:office:office" xmlns:oel="http://schemas.microsoft.com/office/2019/extlst" xmlns:r="http://schemas.openxmlformats.org/officeDocument/2006/relationships" xmlns:m="http://schemas.openxmlformats.org/officeDocument/2006/math" xmlns:v="urn:schemas-microsoft-com:vml" xmlns:wp14="http://schemas.microsoft.com/office/word/2010/wordprocessingDrawing" xmlns:wp="http://schemas.openxmlformats.org/drawingml/2006/wordprocessingDrawing" xmlns:w10="urn:schemas-microsoft-com:office:word" xmlns:w="http://schemas.openxmlformats.org/wordprocessingml/2006/main" xmlns:w14="http://schemas.microsoft.com/office/word/2010/wordml" xmlns:w15="http://schemas.microsoft.com/office/word/2012/wordml" xmlns:w16cex="http://schemas.microsoft.com/office/word/2018/wordml/cex" xmlns:w16cid="http://schemas.microsoft.com/office/word/2016/wordml/cid" xmlns:w16="http://schemas.microsoft.com/office/word/2018/wordml" xmlns:w16du="http://schemas.microsoft.com/office/word/2023/wordml/word16du" xmlns:w16sdtdh="http://schemas.microsoft.com/office/word/2020/wordml/sdtdatahash" xmlns:w16sdtfl="http://schemas.microsoft.com/office/word/2024/wordml/sdtformatlock" xmlns:w16se="http://schemas.microsoft.com/office/word/2015/wordml/symex" xmlns:wpg="http://schemas.microsoft.com/office/word/2010/wordprocessingGroup" xmlns:wpi="http://schemas.microsoft.com/office/word/2010/wordprocessingInk" xmlns:wne="http://schemas.microsoft.com/office/word/2006/wordml" xmlns:wps="http://schemas.microsoft.com/office/word/2010/wordprocessingShape" mc:Ignorable="w14 w15 w16se w16cid w16 w16cex w16sdtdh w16sdtfl w16du wp14">
+  <w:abstractNum w:abstractNumId="0" w15:restartNumberingAfterBreak="0">
+    <w:nsid w:val="0C0B25A0"/>
+    <w:multiLevelType w:val="hybridMultilevel"/>
+    <w:tmpl w:val="9A84617E"/>
+    <w:lvl w:ilvl="0" w:tplc="080A000F">
+      <w:start w:val="1"/>
+      <w:numFmt w:val="decimal"/>
+      <w:lvlText w:val="%1."/>
+      <w:lvlJc w:val="left"/>
+      <w:pPr>
+        <w:ind w:left="720" w:hanging="360"/>
+      </w:pPr>
+      <w:rPr>
+        <w:rFonts w:hint="default"/>
+      </w:rPr>
+    </w:lvl>
+    <w:lvl w:ilvl="1" w:tplc="080A0019" w:tentative="1">
+      <w:start w:val="1"/>
+      <w:numFmt w:val="lowerLetter"/>
+      <w:lvlText w:val="%2."/>
+      <w:lvlJc w:val="left"/>
+      <w:pPr>
+        <w:ind w:left="1440" w:hanging="360"/>
+      </w:pPr>
+    </w:lvl>
+    <w:lvl w:ilvl="2" w:tplc="080A001B" w:tentative="1">
+      <w:start w:val="1"/>
+      <w:numFmt w:val="lowerRoman"/>
+      <w:lvlText w:val="%3."/>
+      <w:lvlJc w:val="right"/>
+      <w:pPr>
+        <w:ind w:left="2160" w:hanging="180"/>
+      </w:pPr>
+    </w:lvl>
+    <w:lvl w:ilvl="3" w:tplc="080A000F" w:tentative="1">
+      <w:start w:val="1"/>
+      <w:numFmt w:val="decimal"/>
+      <w:lvlText w:val="%4."/>
+      <w:lvlJc w:val="left"/>
+      <w:pPr>
+        <w:ind w:left="2880" w:hanging="360"/>
+      </w:pPr>
+    </w:lvl>
+    <w:lvl w:ilvl="4" w:tplc="080A0019" w:tentative="1">
+      <w:start w:val="1"/>
+      <w:numFmt w:val="lowerLetter"/>
+      <w:lvlText w:val="%5."/>
+      <w:lvlJc w:val="left"/>
+      <w:pPr>
+        <w:ind w:left="3600" w:hanging="360"/>
+      </w:pPr>
+    </w:lvl>
+    <w:lvl w:ilvl="5" w:tplc="080A001B" w:tentative="1">
+      <w:start w:val="1"/>
+      <w:numFmt w:val="lowerRoman"/>
+      <w:lvlText w:val="%6."/>
+      <w:lvlJc w:val="right"/>
+      <w:pPr>
+        <w:ind w:left="4320" w:hanging="180"/>
+      </w:pPr>
+    </w:lvl>
+    <w:lvl w:ilvl="6" w:tplc="080A000F" w:tentative="1">
+      <w:start w:val="1"/>
+      <w:numFmt w:val="decimal"/>
+      <w:lvlText w:val="%7."/>
+      <w:lvlJc w:val="left"/>
+      <w:pPr>
+        <w:ind w:left="5040" w:hanging="360"/>
+      </w:pPr>
+    </w:lvl>
+    <w:lvl w:ilvl="7" w:tplc="080A0019" w:tentative="1">
+      <w:start w:val="1"/>
+      <w:numFmt w:val="lowerLetter"/>
+      <w:lvlText w:val="%8."/>
+      <w:lvlJc w:val="left"/>
+      <w:pPr>
+        <w:ind w:left="5760" w:hanging="360"/>
+      </w:pPr>
+    </w:lvl>
+    <w:lvl w:ilvl="8" w:tplc="080A001B" w:tentative="1">
+      <w:start w:val="1"/>
+      <w:numFmt w:val="lowerRoman"/>
+      <w:lvlText w:val="%9."/>
+      <w:lvlJc w:val="right"/>
+      <w:pPr>
+        <w:ind w:left="6480" w:hanging="180"/>
+      </w:pPr>
+    </w:lvl>
+  </w:abstractNum>
+  <w:abstractNum w:abstractNumId="1" w15:restartNumberingAfterBreak="0">
+    <w:nsid w:val="3EB155A9"/>
+    <w:multiLevelType w:val="hybridMultilevel"/>
+    <w:tmpl w:val="BC8271BA"/>
+    <w:lvl w:ilvl="0" w:tplc="080A000F">
+      <w:start w:val="1"/>
+      <w:numFmt w:val="decimal"/>
+      <w:lvlText w:val="%1."/>
+      <w:lvlJc w:val="left"/>
+      <w:pPr>
+        <w:ind w:left="720" w:hanging="360"/>
+      </w:pPr>
+      <w:rPr>
+        <w:rFonts w:hint="default"/>
+      </w:rPr>
+    </w:lvl>
+    <w:lvl w:ilvl="1" w:tplc="080A0019" w:tentative="1">
+      <w:start w:val="1"/>
+      <w:numFmt w:val="lowerLetter"/>
+      <w:lvlText w:val="%2."/>
+      <w:lvlJc w:val="left"/>
+      <w:pPr>
+        <w:ind w:left="1440" w:hanging="360"/>
+      </w:pPr>
+    </w:lvl>
+    <w:lvl w:ilvl="2" w:tplc="080A001B" w:tentative="1">
+      <w:start w:val="1"/>
+      <w:numFmt w:val="lowerRoman"/>
+      <w:lvlText w:val="%3."/>
+      <w:lvlJc w:val="right"/>
+      <w:pPr>
+        <w:ind w:left="2160" w:hanging="180"/>
+      </w:pPr>
+    </w:lvl>
+    <w:lvl w:ilvl="3" w:tplc="080A000F" w:tentative="1">
+      <w:start w:val="1"/>
+      <w:numFmt w:val="decimal"/>
+      <w:lvlText w:val="%4."/>
+      <w:lvlJc w:val="left"/>
+      <w:pPr>
+        <w:ind w:left="2880" w:hanging="360"/>
+      </w:pPr>
+    </w:lvl>
+    <w:lvl w:ilvl="4" w:tplc="080A0019" w:tentative="1">
+      <w:start w:val="1"/>
+      <w:numFmt w:val="lowerLetter"/>
+      <w:lvlText w:val="%5."/>
+      <w:lvlJc w:val="left"/>
+      <w:pPr>
+        <w:ind w:left="3600" w:hanging="360"/>
+      </w:pPr>
+    </w:lvl>
+    <w:lvl w:ilvl="5" w:tplc="080A001B" w:tentative="1">
+      <w:start w:val="1"/>
+      <w:numFmt w:val="lowerRoman"/>
+      <w:lvlText w:val="%6."/>
+      <w:lvlJc w:val="right"/>
+      <w:pPr>
+        <w:ind w:left="4320" w:hanging="180"/>
+      </w:pPr>
+    </w:lvl>
+    <w:lvl w:ilvl="6" w:tplc="080A000F" w:tentative="1">
+      <w:start w:val="1"/>
+      <w:numFmt w:val="decimal"/>
+      <w:lvlText w:val="%7."/>
+      <w:lvlJc w:val="left"/>
+      <w:pPr>
+        <w:ind w:left="5040" w:hanging="360"/>
+      </w:pPr>
+    </w:lvl>
+    <w:lvl w:ilvl="7" w:tplc="080A0019" w:tentative="1">
+      <w:start w:val="1"/>
+      <w:numFmt w:val="lowerLetter"/>
+      <w:lvlText w:val="%8."/>
+      <w:lvlJc w:val="left"/>
+      <w:pPr>
+        <w:ind w:left="5760" w:hanging="360"/>
+      </w:pPr>
+    </w:lvl>
+    <w:lvl w:ilvl="8" w:tplc="080A001B" w:tentative="1">
+      <w:start w:val="1"/>
+      <w:numFmt w:val="lowerRoman"/>
+      <w:lvlText w:val="%9."/>
+      <w:lvlJc w:val="right"/>
+      <w:pPr>
+        <w:ind w:left="6480" w:hanging="180"/>
+      </w:pPr>
+    </w:lvl>
+  </w:abstractNum>
+  <w:num w:numId="1" w16cid:durableId="1184245370">
+    <w:abstractNumId w:val="1"/>
+  </w:num>
+  <w:num w:numId="2" w16cid:durableId="1309285722">
+    <w:abstractNumId w:val="0"/>
+  </w:num>
+</w:numbering>
 </file>
 
 <file path=word/styles.xml><?xml version="1.0" encoding="utf-8"?>

</xml_diff>

<commit_message>
MAS DATOS EN MATRIZ
</commit_message>
<xml_diff>
--- a/DOCUMENTACION/MATRIZ DE TRAZABILIDAD LUIS DIEGO MORALES.docx
+++ b/DOCUMENTACION/MATRIZ DE TRAZABILIDAD LUIS DIEGO MORALES.docx
@@ -22,20 +22,20 @@
         <w:tblLook w:val="04A0" w:firstRow="1" w:lastRow="0" w:firstColumn="1" w:lastColumn="0" w:noHBand="0" w:noVBand="1"/>
       </w:tblPr>
       <w:tblGrid>
-        <w:gridCol w:w="1412"/>
-        <w:gridCol w:w="353"/>
-        <w:gridCol w:w="1766"/>
-        <w:gridCol w:w="34"/>
-        <w:gridCol w:w="1731"/>
-        <w:gridCol w:w="204"/>
-        <w:gridCol w:w="1562"/>
-        <w:gridCol w:w="361"/>
-        <w:gridCol w:w="1405"/>
+        <w:gridCol w:w="818"/>
+        <w:gridCol w:w="17"/>
+        <w:gridCol w:w="2343"/>
+        <w:gridCol w:w="145"/>
+        <w:gridCol w:w="2334"/>
+        <w:gridCol w:w="187"/>
+        <w:gridCol w:w="1462"/>
+        <w:gridCol w:w="187"/>
+        <w:gridCol w:w="1335"/>
       </w:tblGrid>
       <w:tr>
         <w:tc>
           <w:tcPr>
-            <w:tcW w:w="1412" w:type="dxa"/>
+            <w:tcW w:w="849" w:type="dxa"/>
           </w:tcPr>
           <w:p>
             <w:r>
@@ -45,7 +45,7 @@
         </w:tc>
         <w:tc>
           <w:tcPr>
-            <w:tcW w:w="2153" w:type="dxa"/>
+            <w:tcW w:w="2319" w:type="dxa"/>
             <w:gridSpan w:val="3"/>
           </w:tcPr>
           <w:p>
@@ -56,7 +56,7 @@
         </w:tc>
         <w:tc>
           <w:tcPr>
-            <w:tcW w:w="1935" w:type="dxa"/>
+            <w:tcW w:w="2585" w:type="dxa"/>
             <w:gridSpan w:val="2"/>
           </w:tcPr>
           <w:p>
@@ -67,7 +67,7 @@
         </w:tc>
         <w:tc>
           <w:tcPr>
-            <w:tcW w:w="1923" w:type="dxa"/>
+            <w:tcW w:w="1711" w:type="dxa"/>
             <w:gridSpan w:val="2"/>
           </w:tcPr>
           <w:p>
@@ -78,7 +78,7 @@
         </w:tc>
         <w:tc>
           <w:tcPr>
-            <w:tcW w:w="1405" w:type="dxa"/>
+            <w:tcW w:w="1364" w:type="dxa"/>
           </w:tcPr>
           <w:p>
             <w:r>
@@ -103,7 +103,7 @@
       <w:tr>
         <w:tc>
           <w:tcPr>
-            <w:tcW w:w="1412" w:type="dxa"/>
+            <w:tcW w:w="849" w:type="dxa"/>
           </w:tcPr>
           <w:p>
             <w:r>
@@ -113,7 +113,7 @@
         </w:tc>
         <w:tc>
           <w:tcPr>
-            <w:tcW w:w="2153" w:type="dxa"/>
+            <w:tcW w:w="2319" w:type="dxa"/>
             <w:gridSpan w:val="3"/>
           </w:tcPr>
           <w:p>
@@ -131,7 +131,7 @@
         </w:tc>
         <w:tc>
           <w:tcPr>
-            <w:tcW w:w="1935" w:type="dxa"/>
+            <w:tcW w:w="2585" w:type="dxa"/>
             <w:gridSpan w:val="2"/>
           </w:tcPr>
           <w:p>
@@ -142,7 +142,7 @@
         </w:tc>
         <w:tc>
           <w:tcPr>
-            <w:tcW w:w="1923" w:type="dxa"/>
+            <w:tcW w:w="1711" w:type="dxa"/>
             <w:gridSpan w:val="2"/>
           </w:tcPr>
           <w:p>
@@ -153,7 +153,7 @@
         </w:tc>
         <w:tc>
           <w:tcPr>
-            <w:tcW w:w="1405" w:type="dxa"/>
+            <w:tcW w:w="1364" w:type="dxa"/>
           </w:tcPr>
           <w:p>
             <w:r>
@@ -165,7 +165,7 @@
       <w:tr>
         <w:tc>
           <w:tcPr>
-            <w:tcW w:w="1412" w:type="dxa"/>
+            <w:tcW w:w="849" w:type="dxa"/>
           </w:tcPr>
           <w:p>
             <w:r>
@@ -175,7 +175,7 @@
         </w:tc>
         <w:tc>
           <w:tcPr>
-            <w:tcW w:w="2153" w:type="dxa"/>
+            <w:tcW w:w="2319" w:type="dxa"/>
             <w:gridSpan w:val="3"/>
           </w:tcPr>
           <w:p>
@@ -193,7 +193,7 @@
         </w:tc>
         <w:tc>
           <w:tcPr>
-            <w:tcW w:w="1935" w:type="dxa"/>
+            <w:tcW w:w="2585" w:type="dxa"/>
             <w:gridSpan w:val="2"/>
           </w:tcPr>
           <w:p>
@@ -204,7 +204,7 @@
         </w:tc>
         <w:tc>
           <w:tcPr>
-            <w:tcW w:w="1923" w:type="dxa"/>
+            <w:tcW w:w="1711" w:type="dxa"/>
             <w:gridSpan w:val="2"/>
           </w:tcPr>
           <w:p>
@@ -215,7 +215,7 @@
         </w:tc>
         <w:tc>
           <w:tcPr>
-            <w:tcW w:w="1405" w:type="dxa"/>
+            <w:tcW w:w="1364" w:type="dxa"/>
           </w:tcPr>
           <w:p>
             <w:r>
@@ -227,7 +227,7 @@
       <w:tr>
         <w:tc>
           <w:tcPr>
-            <w:tcW w:w="1412" w:type="dxa"/>
+            <w:tcW w:w="849" w:type="dxa"/>
           </w:tcPr>
           <w:p>
             <w:r>
@@ -237,7 +237,7 @@
         </w:tc>
         <w:tc>
           <w:tcPr>
-            <w:tcW w:w="2153" w:type="dxa"/>
+            <w:tcW w:w="2319" w:type="dxa"/>
             <w:gridSpan w:val="3"/>
           </w:tcPr>
           <w:p>
@@ -255,18 +255,23 @@
         </w:tc>
         <w:tc>
           <w:tcPr>
-            <w:tcW w:w="1935" w:type="dxa"/>
-            <w:gridSpan w:val="2"/>
-          </w:tcPr>
-          <w:p>
-            <w:r>
-              <w:t>CREATE TABLE ubicaciones….</w:t>
-            </w:r>
-          </w:p>
-        </w:tc>
-        <w:tc>
-          <w:tcPr>
-            <w:tcW w:w="1923" w:type="dxa"/>
+            <w:tcW w:w="2585" w:type="dxa"/>
+            <w:gridSpan w:val="2"/>
+          </w:tcPr>
+          <w:p>
+            <w:r>
+              <w:t xml:space="preserve">CREATE TABLE </w:t>
+            </w:r>
+            <w:proofErr w:type="gramStart"/>
+            <w:r>
+              <w:t>ubicaciones….</w:t>
+            </w:r>
+            <w:proofErr w:type="gramEnd"/>
+          </w:p>
+        </w:tc>
+        <w:tc>
+          <w:tcPr>
+            <w:tcW w:w="1711" w:type="dxa"/>
             <w:gridSpan w:val="2"/>
           </w:tcPr>
           <w:p>
@@ -277,7 +282,7 @@
         </w:tc>
         <w:tc>
           <w:tcPr>
-            <w:tcW w:w="1405" w:type="dxa"/>
+            <w:tcW w:w="1364" w:type="dxa"/>
           </w:tcPr>
           <w:p>
             <w:r>
@@ -289,7 +294,7 @@
       <w:tr>
         <w:tc>
           <w:tcPr>
-            <w:tcW w:w="1412" w:type="dxa"/>
+            <w:tcW w:w="849" w:type="dxa"/>
           </w:tcPr>
           <w:p>
             <w:r>
@@ -299,7 +304,7 @@
         </w:tc>
         <w:tc>
           <w:tcPr>
-            <w:tcW w:w="2153" w:type="dxa"/>
+            <w:tcW w:w="2319" w:type="dxa"/>
             <w:gridSpan w:val="3"/>
           </w:tcPr>
           <w:p>
@@ -317,18 +322,26 @@
         </w:tc>
         <w:tc>
           <w:tcPr>
-            <w:tcW w:w="1935" w:type="dxa"/>
-            <w:gridSpan w:val="2"/>
-          </w:tcPr>
-          <w:p>
-            <w:r>
-              <w:t>Relación 1:N “tienen”</w:t>
-            </w:r>
-          </w:p>
-        </w:tc>
-        <w:tc>
-          <w:tcPr>
-            <w:tcW w:w="1923" w:type="dxa"/>
+            <w:tcW w:w="2585" w:type="dxa"/>
+            <w:gridSpan w:val="2"/>
+          </w:tcPr>
+          <w:p>
+            <w:r>
+              <w:t xml:space="preserve">Relación </w:t>
+            </w:r>
+            <w:proofErr w:type="gramStart"/>
+            <w:r>
+              <w:t>1:N</w:t>
+            </w:r>
+            <w:proofErr w:type="gramEnd"/>
+            <w:r>
+              <w:t xml:space="preserve"> “tienen”</w:t>
+            </w:r>
+          </w:p>
+        </w:tc>
+        <w:tc>
+          <w:tcPr>
+            <w:tcW w:w="1711" w:type="dxa"/>
             <w:gridSpan w:val="2"/>
           </w:tcPr>
           <w:p>
@@ -339,7 +352,7 @@
         </w:tc>
         <w:tc>
           <w:tcPr>
-            <w:tcW w:w="1405" w:type="dxa"/>
+            <w:tcW w:w="1364" w:type="dxa"/>
           </w:tcPr>
           <w:p>
             <w:r>
@@ -351,7 +364,7 @@
       <w:tr>
         <w:tc>
           <w:tcPr>
-            <w:tcW w:w="1412" w:type="dxa"/>
+            <w:tcW w:w="849" w:type="dxa"/>
           </w:tcPr>
           <w:p>
             <w:r>
@@ -361,7 +374,7 @@
         </w:tc>
         <w:tc>
           <w:tcPr>
-            <w:tcW w:w="2153" w:type="dxa"/>
+            <w:tcW w:w="2319" w:type="dxa"/>
             <w:gridSpan w:val="3"/>
           </w:tcPr>
           <w:p>
@@ -375,18 +388,26 @@
         </w:tc>
         <w:tc>
           <w:tcPr>
-            <w:tcW w:w="1935" w:type="dxa"/>
-            <w:gridSpan w:val="2"/>
-          </w:tcPr>
-          <w:p>
-            <w:r>
-              <w:t>ALTER TABLE eventos y el trigger de no traslape</w:t>
-            </w:r>
-          </w:p>
-        </w:tc>
-        <w:tc>
-          <w:tcPr>
-            <w:tcW w:w="1923" w:type="dxa"/>
+            <w:tcW w:w="2585" w:type="dxa"/>
+            <w:gridSpan w:val="2"/>
+          </w:tcPr>
+          <w:p>
+            <w:r>
+              <w:t xml:space="preserve">ALTER TABLE eventos y el </w:t>
+            </w:r>
+            <w:proofErr w:type="spellStart"/>
+            <w:r>
+              <w:t>trigger</w:t>
+            </w:r>
+            <w:proofErr w:type="spellEnd"/>
+            <w:r>
+              <w:t xml:space="preserve"> de no traslape</w:t>
+            </w:r>
+          </w:p>
+        </w:tc>
+        <w:tc>
+          <w:tcPr>
+            <w:tcW w:w="1711" w:type="dxa"/>
             <w:gridSpan w:val="2"/>
           </w:tcPr>
           <w:p>
@@ -397,7 +418,7 @@
         </w:tc>
         <w:tc>
           <w:tcPr>
-            <w:tcW w:w="1405" w:type="dxa"/>
+            <w:tcW w:w="1364" w:type="dxa"/>
           </w:tcPr>
           <w:p>
             <w:r>
@@ -409,7 +430,7 @@
       <w:tr>
         <w:tc>
           <w:tcPr>
-            <w:tcW w:w="1412" w:type="dxa"/>
+            <w:tcW w:w="849" w:type="dxa"/>
           </w:tcPr>
           <w:p>
             <w:r>
@@ -419,7 +440,7 @@
         </w:tc>
         <w:tc>
           <w:tcPr>
-            <w:tcW w:w="2153" w:type="dxa"/>
+            <w:tcW w:w="2319" w:type="dxa"/>
             <w:gridSpan w:val="3"/>
           </w:tcPr>
           <w:p>
@@ -430,7 +451,7 @@
         </w:tc>
         <w:tc>
           <w:tcPr>
-            <w:tcW w:w="1935" w:type="dxa"/>
+            <w:tcW w:w="2585" w:type="dxa"/>
             <w:gridSpan w:val="2"/>
           </w:tcPr>
           <w:p>
@@ -441,7 +462,7 @@
         </w:tc>
         <w:tc>
           <w:tcPr>
-            <w:tcW w:w="1923" w:type="dxa"/>
+            <w:tcW w:w="1711" w:type="dxa"/>
             <w:gridSpan w:val="2"/>
           </w:tcPr>
           <w:p>
@@ -452,7 +473,7 @@
         </w:tc>
         <w:tc>
           <w:tcPr>
-            <w:tcW w:w="1405" w:type="dxa"/>
+            <w:tcW w:w="1364" w:type="dxa"/>
           </w:tcPr>
           <w:p>
             <w:r>
@@ -464,7 +485,7 @@
       <w:tr>
         <w:tc>
           <w:tcPr>
-            <w:tcW w:w="1412" w:type="dxa"/>
+            <w:tcW w:w="849" w:type="dxa"/>
           </w:tcPr>
           <w:p>
             <w:r>
@@ -474,7 +495,7 @@
         </w:tc>
         <w:tc>
           <w:tcPr>
-            <w:tcW w:w="2153" w:type="dxa"/>
+            <w:tcW w:w="2319" w:type="dxa"/>
             <w:gridSpan w:val="3"/>
           </w:tcPr>
           <w:p>
@@ -485,7 +506,7 @@
         </w:tc>
         <w:tc>
           <w:tcPr>
-            <w:tcW w:w="1935" w:type="dxa"/>
+            <w:tcW w:w="2585" w:type="dxa"/>
             <w:gridSpan w:val="2"/>
           </w:tcPr>
           <w:p>
@@ -496,7 +517,7 @@
         </w:tc>
         <w:tc>
           <w:tcPr>
-            <w:tcW w:w="1923" w:type="dxa"/>
+            <w:tcW w:w="1711" w:type="dxa"/>
             <w:gridSpan w:val="2"/>
           </w:tcPr>
           <w:p>
@@ -507,7 +528,7 @@
         </w:tc>
         <w:tc>
           <w:tcPr>
-            <w:tcW w:w="1405" w:type="dxa"/>
+            <w:tcW w:w="1364" w:type="dxa"/>
           </w:tcPr>
           <w:p>
             <w:r>
@@ -519,7 +540,7 @@
       <w:tr>
         <w:tc>
           <w:tcPr>
-            <w:tcW w:w="1412" w:type="dxa"/>
+            <w:tcW w:w="849" w:type="dxa"/>
           </w:tcPr>
           <w:p>
             <w:r>
@@ -529,7 +550,7 @@
         </w:tc>
         <w:tc>
           <w:tcPr>
-            <w:tcW w:w="2153" w:type="dxa"/>
+            <w:tcW w:w="2319" w:type="dxa"/>
             <w:gridSpan w:val="3"/>
           </w:tcPr>
           <w:p>
@@ -540,7 +561,7 @@
         </w:tc>
         <w:tc>
           <w:tcPr>
-            <w:tcW w:w="1935" w:type="dxa"/>
+            <w:tcW w:w="2585" w:type="dxa"/>
             <w:gridSpan w:val="2"/>
           </w:tcPr>
           <w:p>
@@ -551,7 +572,7 @@
         </w:tc>
         <w:tc>
           <w:tcPr>
-            <w:tcW w:w="1923" w:type="dxa"/>
+            <w:tcW w:w="1711" w:type="dxa"/>
             <w:gridSpan w:val="2"/>
           </w:tcPr>
           <w:p>
@@ -562,7 +583,7 @@
         </w:tc>
         <w:tc>
           <w:tcPr>
-            <w:tcW w:w="1405" w:type="dxa"/>
+            <w:tcW w:w="1364" w:type="dxa"/>
           </w:tcPr>
           <w:p>
             <w:r>
@@ -588,34 +609,710 @@
       <w:tr>
         <w:tc>
           <w:tcPr>
-            <w:tcW w:w="1765" w:type="dxa"/>
+            <w:tcW w:w="1065" w:type="dxa"/>
+            <w:gridSpan w:val="2"/>
+          </w:tcPr>
+          <w:p>
+            <w:r>
+              <w:t>RF-13</w:t>
+            </w:r>
+          </w:p>
+        </w:tc>
+        <w:tc>
+          <w:tcPr>
+            <w:tcW w:w="1887" w:type="dxa"/>
+          </w:tcPr>
+          <w:p>
+            <w:pPr>
+              <w:pStyle w:val="Prrafodelista"/>
+              <w:numPr>
+                <w:ilvl w:val="0"/>
+                <w:numId w:val="3"/>
+              </w:numPr>
+            </w:pPr>
+            <w:r>
+              <w:t>Modelo conceptual</w:t>
+            </w:r>
+          </w:p>
+        </w:tc>
+        <w:tc>
+          <w:tcPr>
+            <w:tcW w:w="2585" w:type="dxa"/>
+            <w:gridSpan w:val="2"/>
+          </w:tcPr>
+          <w:p>
+            <w:r>
+              <w:t>Entidad SERIES_EVENTOS</w:t>
+            </w:r>
+          </w:p>
+        </w:tc>
+        <w:tc>
+          <w:tcPr>
+            <w:tcW w:w="1711" w:type="dxa"/>
+            <w:gridSpan w:val="2"/>
+          </w:tcPr>
+          <w:p>
+            <w:r>
+              <w:t>COMPLETADO</w:t>
+            </w:r>
+          </w:p>
+        </w:tc>
+        <w:tc>
+          <w:tcPr>
+            <w:tcW w:w="1580" w:type="dxa"/>
+            <w:gridSpan w:val="2"/>
+          </w:tcPr>
+          <w:p>
+            <w:r>
+              <w:t>05/09/2026</w:t>
+            </w:r>
+          </w:p>
+        </w:tc>
+      </w:tr>
+      <w:tr>
+        <w:tc>
+          <w:tcPr>
+            <w:tcW w:w="1065" w:type="dxa"/>
+            <w:gridSpan w:val="2"/>
+          </w:tcPr>
+          <w:p>
+            <w:r>
+              <w:t>RF-13</w:t>
+            </w:r>
+          </w:p>
+        </w:tc>
+        <w:tc>
+          <w:tcPr>
+            <w:tcW w:w="1887" w:type="dxa"/>
+          </w:tcPr>
+          <w:p>
+            <w:pPr>
+              <w:pStyle w:val="Prrafodelista"/>
+              <w:numPr>
+                <w:ilvl w:val="0"/>
+                <w:numId w:val="3"/>
+              </w:numPr>
+            </w:pPr>
+            <w:r>
+              <w:t>Modelo lógico</w:t>
+            </w:r>
+          </w:p>
+        </w:tc>
+        <w:tc>
+          <w:tcPr>
+            <w:tcW w:w="2585" w:type="dxa"/>
+            <w:gridSpan w:val="2"/>
+          </w:tcPr>
+          <w:p>
+            <w:r>
+              <w:t xml:space="preserve">Las </w:t>
+            </w:r>
+            <w:proofErr w:type="spellStart"/>
+            <w:r>
+              <w:t>Pk</w:t>
+            </w:r>
+            <w:proofErr w:type="spellEnd"/>
+            <w:r>
+              <w:t xml:space="preserve"> de </w:t>
+            </w:r>
+            <w:proofErr w:type="spellStart"/>
+            <w:r>
+              <w:t>id_serie</w:t>
+            </w:r>
+            <w:proofErr w:type="spellEnd"/>
+            <w:r>
+              <w:t xml:space="preserve">, </w:t>
+            </w:r>
+            <w:proofErr w:type="spellStart"/>
+            <w:r>
+              <w:t>id_usuario_propietario</w:t>
+            </w:r>
+            <w:proofErr w:type="spellEnd"/>
+            <w:r>
+              <w:t xml:space="preserve">, </w:t>
+            </w:r>
+            <w:proofErr w:type="spellStart"/>
+            <w:r>
+              <w:t>etc</w:t>
+            </w:r>
+            <w:proofErr w:type="spellEnd"/>
+          </w:p>
+        </w:tc>
+        <w:tc>
+          <w:tcPr>
+            <w:tcW w:w="1711" w:type="dxa"/>
+            <w:gridSpan w:val="2"/>
+          </w:tcPr>
+          <w:p>
+            <w:r>
+              <w:t>COMPLETADO</w:t>
+            </w:r>
+          </w:p>
+        </w:tc>
+        <w:tc>
+          <w:tcPr>
+            <w:tcW w:w="1580" w:type="dxa"/>
+            <w:gridSpan w:val="2"/>
+          </w:tcPr>
+          <w:p>
+            <w:r>
+              <w:t>07/09/2026</w:t>
+            </w:r>
+          </w:p>
+        </w:tc>
+      </w:tr>
+      <w:tr>
+        <w:tc>
+          <w:tcPr>
+            <w:tcW w:w="1065" w:type="dxa"/>
+            <w:gridSpan w:val="2"/>
+          </w:tcPr>
+          <w:p>
+            <w:r>
+              <w:t>RF-13</w:t>
+            </w:r>
+          </w:p>
+        </w:tc>
+        <w:tc>
+          <w:tcPr>
+            <w:tcW w:w="1887" w:type="dxa"/>
+          </w:tcPr>
+          <w:p>
+            <w:pPr>
+              <w:pStyle w:val="Prrafodelista"/>
+              <w:numPr>
+                <w:ilvl w:val="0"/>
+                <w:numId w:val="3"/>
+              </w:numPr>
+            </w:pPr>
+            <w:r>
+              <w:t xml:space="preserve">Modelo físico en </w:t>
+            </w:r>
+            <w:proofErr w:type="spellStart"/>
+            <w:r>
+              <w:t>sql</w:t>
+            </w:r>
+            <w:proofErr w:type="spellEnd"/>
+          </w:p>
+        </w:tc>
+        <w:tc>
+          <w:tcPr>
+            <w:tcW w:w="2585" w:type="dxa"/>
+            <w:gridSpan w:val="2"/>
+          </w:tcPr>
+          <w:p>
+            <w:r>
+              <w:t xml:space="preserve">CREATE TABLE </w:t>
+            </w:r>
+            <w:proofErr w:type="spellStart"/>
+            <w:r>
+              <w:t>series_eventos</w:t>
+            </w:r>
+            <w:proofErr w:type="spellEnd"/>
+          </w:p>
+        </w:tc>
+        <w:tc>
+          <w:tcPr>
+            <w:tcW w:w="1711" w:type="dxa"/>
+            <w:gridSpan w:val="2"/>
+          </w:tcPr>
+          <w:p>
+            <w:r>
+              <w:t>COMPLETADO</w:t>
+            </w:r>
+          </w:p>
+        </w:tc>
+        <w:tc>
+          <w:tcPr>
+            <w:tcW w:w="1580" w:type="dxa"/>
+            <w:gridSpan w:val="2"/>
+          </w:tcPr>
+          <w:p>
+            <w:r>
+              <w:t>09/09/2026</w:t>
+            </w:r>
+          </w:p>
+        </w:tc>
+      </w:tr>
+      <w:tr>
+        <w:tc>
+          <w:tcPr>
+            <w:tcW w:w="1065" w:type="dxa"/>
+            <w:gridSpan w:val="2"/>
+          </w:tcPr>
+          <w:p>
+            <w:r>
+              <w:t>RF-14</w:t>
+            </w:r>
+          </w:p>
+        </w:tc>
+        <w:tc>
+          <w:tcPr>
+            <w:tcW w:w="1887" w:type="dxa"/>
+          </w:tcPr>
+          <w:p>
+            <w:pPr>
+              <w:pStyle w:val="Prrafodelista"/>
+              <w:numPr>
+                <w:ilvl w:val="0"/>
+                <w:numId w:val="3"/>
+              </w:numPr>
+            </w:pPr>
+            <w:r>
+              <w:t>Interfaz gráfica</w:t>
+            </w:r>
+          </w:p>
+        </w:tc>
+        <w:tc>
+          <w:tcPr>
+            <w:tcW w:w="2585" w:type="dxa"/>
+            <w:gridSpan w:val="2"/>
+          </w:tcPr>
+          <w:p>
+            <w:r>
+              <w:t xml:space="preserve">Generación automática de </w:t>
+            </w:r>
+            <w:r>
+              <w:lastRenderedPageBreak/>
+              <w:t>ocurrencias en Python</w:t>
+            </w:r>
+          </w:p>
+        </w:tc>
+        <w:tc>
+          <w:tcPr>
+            <w:tcW w:w="1711" w:type="dxa"/>
+            <w:gridSpan w:val="2"/>
+          </w:tcPr>
+          <w:p>
+            <w:r>
+              <w:lastRenderedPageBreak/>
+              <w:t>COMPLETADO</w:t>
+            </w:r>
+          </w:p>
+        </w:tc>
+        <w:tc>
+          <w:tcPr>
+            <w:tcW w:w="1580" w:type="dxa"/>
+            <w:gridSpan w:val="2"/>
+          </w:tcPr>
+          <w:p>
+            <w:r>
+              <w:t>11/09/2026</w:t>
+            </w:r>
+          </w:p>
+        </w:tc>
+      </w:tr>
+      <w:tr>
+        <w:tc>
+          <w:tcPr>
+            <w:tcW w:w="8828" w:type="dxa"/>
+            <w:gridSpan w:val="9"/>
+          </w:tcPr>
+          <w:p>
+            <w:r>
+              <w:t>MÓDULO DE TAREAS ASOCIADAS A EVENTOS</w:t>
+            </w:r>
+          </w:p>
+        </w:tc>
+      </w:tr>
+      <w:tr>
+        <w:tc>
+          <w:tcPr>
+            <w:tcW w:w="1065" w:type="dxa"/>
+            <w:gridSpan w:val="2"/>
+          </w:tcPr>
+          <w:p>
+            <w:r>
+              <w:t>RF-15</w:t>
+            </w:r>
+          </w:p>
+        </w:tc>
+        <w:tc>
+          <w:tcPr>
+            <w:tcW w:w="1887" w:type="dxa"/>
+          </w:tcPr>
+          <w:p>
+            <w:pPr>
+              <w:pStyle w:val="Prrafodelista"/>
+              <w:numPr>
+                <w:ilvl w:val="0"/>
+                <w:numId w:val="4"/>
+              </w:numPr>
+            </w:pPr>
+            <w:r>
+              <w:t>Modelo conceptual</w:t>
+            </w:r>
+          </w:p>
+        </w:tc>
+        <w:tc>
+          <w:tcPr>
+            <w:tcW w:w="2585" w:type="dxa"/>
+            <w:gridSpan w:val="2"/>
+          </w:tcPr>
+          <w:p>
+            <w:r>
+              <w:t>Entidad TAREAS y sus relaciones</w:t>
+            </w:r>
+          </w:p>
+        </w:tc>
+        <w:tc>
+          <w:tcPr>
+            <w:tcW w:w="1711" w:type="dxa"/>
+            <w:gridSpan w:val="2"/>
+          </w:tcPr>
+          <w:p>
+            <w:r>
+              <w:t>COMPLETADO</w:t>
+            </w:r>
+          </w:p>
+        </w:tc>
+        <w:tc>
+          <w:tcPr>
+            <w:tcW w:w="1580" w:type="dxa"/>
+            <w:gridSpan w:val="2"/>
+          </w:tcPr>
+          <w:p>
+            <w:r>
+              <w:t>05 y 06 de setiembre del 2026</w:t>
+            </w:r>
+          </w:p>
+        </w:tc>
+      </w:tr>
+      <w:tr>
+        <w:tc>
+          <w:tcPr>
+            <w:tcW w:w="1065" w:type="dxa"/>
+            <w:gridSpan w:val="2"/>
+          </w:tcPr>
+          <w:p>
+            <w:r>
+              <w:t>RF-15</w:t>
+            </w:r>
+          </w:p>
+        </w:tc>
+        <w:tc>
+          <w:tcPr>
+            <w:tcW w:w="1887" w:type="dxa"/>
+          </w:tcPr>
+          <w:p>
+            <w:pPr>
+              <w:pStyle w:val="Prrafodelista"/>
+              <w:numPr>
+                <w:ilvl w:val="0"/>
+                <w:numId w:val="4"/>
+              </w:numPr>
+            </w:pPr>
+            <w:r>
+              <w:t xml:space="preserve">Modelo lógico </w:t>
+            </w:r>
+          </w:p>
+        </w:tc>
+        <w:tc>
+          <w:tcPr>
+            <w:tcW w:w="2585" w:type="dxa"/>
+            <w:gridSpan w:val="2"/>
+          </w:tcPr>
+          <w:p>
+            <w:r>
+              <w:t>Se ponen los cascade los PK y los FK</w:t>
+            </w:r>
+          </w:p>
+        </w:tc>
+        <w:tc>
+          <w:tcPr>
+            <w:tcW w:w="1711" w:type="dxa"/>
+            <w:gridSpan w:val="2"/>
+          </w:tcPr>
+          <w:p>
+            <w:r>
+              <w:t>COMPLETADO</w:t>
+            </w:r>
+          </w:p>
+        </w:tc>
+        <w:tc>
+          <w:tcPr>
+            <w:tcW w:w="1580" w:type="dxa"/>
+            <w:gridSpan w:val="2"/>
+          </w:tcPr>
+          <w:p>
+            <w:r>
+              <w:t>07 y 08 de setiembre de 2026</w:t>
+            </w:r>
+          </w:p>
+        </w:tc>
+      </w:tr>
+      <w:tr>
+        <w:tc>
+          <w:tcPr>
+            <w:tcW w:w="1065" w:type="dxa"/>
+            <w:gridSpan w:val="2"/>
+          </w:tcPr>
+          <w:p>
+            <w:r>
+              <w:t>RF-15</w:t>
+            </w:r>
+          </w:p>
+        </w:tc>
+        <w:tc>
+          <w:tcPr>
+            <w:tcW w:w="1887" w:type="dxa"/>
+          </w:tcPr>
+          <w:p>
+            <w:pPr>
+              <w:pStyle w:val="Prrafodelista"/>
+              <w:numPr>
+                <w:ilvl w:val="0"/>
+                <w:numId w:val="4"/>
+              </w:numPr>
+            </w:pPr>
+            <w:r>
+              <w:t>Modelo físico en SQL</w:t>
+            </w:r>
+          </w:p>
+        </w:tc>
+        <w:tc>
+          <w:tcPr>
+            <w:tcW w:w="2585" w:type="dxa"/>
+            <w:gridSpan w:val="2"/>
+          </w:tcPr>
+          <w:p>
+            <w:r>
+              <w:t>CREATE table tareas</w:t>
+            </w:r>
+          </w:p>
+        </w:tc>
+        <w:tc>
+          <w:tcPr>
+            <w:tcW w:w="1711" w:type="dxa"/>
+            <w:gridSpan w:val="2"/>
+          </w:tcPr>
+          <w:p>
+            <w:r>
+              <w:t xml:space="preserve">COMPLETADO </w:t>
+            </w:r>
+          </w:p>
+        </w:tc>
+        <w:tc>
+          <w:tcPr>
+            <w:tcW w:w="1580" w:type="dxa"/>
+            <w:gridSpan w:val="2"/>
+          </w:tcPr>
+          <w:p>
+            <w:r>
+              <w:t>09/09/2026</w:t>
+            </w:r>
+          </w:p>
+        </w:tc>
+      </w:tr>
+      <w:tr>
+        <w:tc>
+          <w:tcPr>
+            <w:tcW w:w="1065" w:type="dxa"/>
+            <w:gridSpan w:val="2"/>
+          </w:tcPr>
+          <w:p>
+            <w:r>
+              <w:t>RF-15</w:t>
+            </w:r>
+          </w:p>
+        </w:tc>
+        <w:tc>
+          <w:tcPr>
+            <w:tcW w:w="1887" w:type="dxa"/>
+          </w:tcPr>
+          <w:p>
+            <w:pPr>
+              <w:pStyle w:val="Prrafodelista"/>
+              <w:numPr>
+                <w:ilvl w:val="0"/>
+                <w:numId w:val="4"/>
+              </w:numPr>
+            </w:pPr>
+            <w:r>
+              <w:t>Interfaz gráfica</w:t>
+            </w:r>
+          </w:p>
+        </w:tc>
+        <w:tc>
+          <w:tcPr>
+            <w:tcW w:w="2585" w:type="dxa"/>
+            <w:gridSpan w:val="2"/>
+          </w:tcPr>
+          <w:p>
+            <w:r>
+              <w:t>CRUD de tareas</w:t>
+            </w:r>
+          </w:p>
+        </w:tc>
+        <w:tc>
+          <w:tcPr>
+            <w:tcW w:w="1711" w:type="dxa"/>
+            <w:gridSpan w:val="2"/>
+          </w:tcPr>
+          <w:p>
+            <w:r>
+              <w:t>COMPLETADO</w:t>
+            </w:r>
+          </w:p>
+        </w:tc>
+        <w:tc>
+          <w:tcPr>
+            <w:tcW w:w="1580" w:type="dxa"/>
+            <w:gridSpan w:val="2"/>
+          </w:tcPr>
+          <w:p>
+            <w:r>
+              <w:t>14/09/2026</w:t>
+            </w:r>
+          </w:p>
+        </w:tc>
+      </w:tr>
+      <w:tr>
+        <w:tc>
+          <w:tcPr>
+            <w:tcW w:w="1065" w:type="dxa"/>
+            <w:gridSpan w:val="2"/>
+          </w:tcPr>
+          <w:p>
+            <w:r>
+              <w:t>RF-16</w:t>
+            </w:r>
+          </w:p>
+        </w:tc>
+        <w:tc>
+          <w:tcPr>
+            <w:tcW w:w="1887" w:type="dxa"/>
+          </w:tcPr>
+          <w:p>
+            <w:pPr>
+              <w:pStyle w:val="Prrafodelista"/>
+            </w:pPr>
+            <w:r>
+              <w:t xml:space="preserve">Modelo físico en SQL </w:t>
+            </w:r>
+          </w:p>
+        </w:tc>
+        <w:tc>
+          <w:tcPr>
+            <w:tcW w:w="2585" w:type="dxa"/>
+            <w:gridSpan w:val="2"/>
+          </w:tcPr>
+          <w:p>
+            <w:r>
+              <w:t>Vistas de usuarios y sus tareas</w:t>
+            </w:r>
+          </w:p>
+        </w:tc>
+        <w:tc>
+          <w:tcPr>
+            <w:tcW w:w="1711" w:type="dxa"/>
+            <w:gridSpan w:val="2"/>
+          </w:tcPr>
+          <w:p>
+            <w:r>
+              <w:t>COMPLETADO</w:t>
+            </w:r>
+          </w:p>
+        </w:tc>
+        <w:tc>
+          <w:tcPr>
+            <w:tcW w:w="1580" w:type="dxa"/>
+            <w:gridSpan w:val="2"/>
+          </w:tcPr>
+          <w:p>
+            <w:r>
+              <w:t>13/09/2026</w:t>
+            </w:r>
+          </w:p>
+        </w:tc>
+      </w:tr>
+      <w:tr>
+        <w:tc>
+          <w:tcPr>
+            <w:tcW w:w="1065" w:type="dxa"/>
+            <w:gridSpan w:val="2"/>
+          </w:tcPr>
+          <w:p>
+            <w:r>
+              <w:t>RF-16</w:t>
+            </w:r>
+          </w:p>
+        </w:tc>
+        <w:tc>
+          <w:tcPr>
+            <w:tcW w:w="1887" w:type="dxa"/>
+          </w:tcPr>
+          <w:p>
+            <w:r>
+              <w:t>4.Interfaz</w:t>
+            </w:r>
+          </w:p>
+        </w:tc>
+        <w:tc>
+          <w:tcPr>
+            <w:tcW w:w="2585" w:type="dxa"/>
+            <w:gridSpan w:val="2"/>
+          </w:tcPr>
+          <w:p>
+            <w:r>
+              <w:t>Paneles de lectura</w:t>
+            </w:r>
+          </w:p>
+        </w:tc>
+        <w:tc>
+          <w:tcPr>
+            <w:tcW w:w="1711" w:type="dxa"/>
+            <w:gridSpan w:val="2"/>
+          </w:tcPr>
+          <w:p>
+            <w:r>
+              <w:t>COMPLETADO</w:t>
+            </w:r>
+          </w:p>
+        </w:tc>
+        <w:tc>
+          <w:tcPr>
+            <w:tcW w:w="1580" w:type="dxa"/>
+            <w:gridSpan w:val="2"/>
+          </w:tcPr>
+          <w:p>
+            <w:r>
+              <w:t>14/09/2026</w:t>
+            </w:r>
+          </w:p>
+        </w:tc>
+      </w:tr>
+      <w:tr>
+        <w:tc>
+          <w:tcPr>
+            <w:tcW w:w="1065" w:type="dxa"/>
             <w:gridSpan w:val="2"/>
           </w:tcPr>
           <w:p/>
         </w:tc>
         <w:tc>
           <w:tcPr>
-            <w:tcW w:w="1766" w:type="dxa"/>
+            <w:tcW w:w="1887" w:type="dxa"/>
           </w:tcPr>
           <w:p/>
         </w:tc>
         <w:tc>
           <w:tcPr>
-            <w:tcW w:w="1765" w:type="dxa"/>
+            <w:tcW w:w="2585" w:type="dxa"/>
             <w:gridSpan w:val="2"/>
           </w:tcPr>
           <w:p/>
         </w:tc>
         <w:tc>
           <w:tcPr>
-            <w:tcW w:w="1766" w:type="dxa"/>
+            <w:tcW w:w="1711" w:type="dxa"/>
             <w:gridSpan w:val="2"/>
           </w:tcPr>
           <w:p/>
         </w:tc>
         <w:tc>
           <w:tcPr>
-            <w:tcW w:w="1766" w:type="dxa"/>
+            <w:tcW w:w="1580" w:type="dxa"/>
             <w:gridSpan w:val="2"/>
           </w:tcPr>
           <w:p/>
@@ -725,6 +1422,95 @@
     </w:lvl>
   </w:abstractNum>
   <w:abstractNum w:abstractNumId="1" w15:restartNumberingAfterBreak="0">
+    <w:nsid w:val="39547C62"/>
+    <w:multiLevelType w:val="hybridMultilevel"/>
+    <w:tmpl w:val="3FD89550"/>
+    <w:lvl w:ilvl="0" w:tplc="56E64632">
+      <w:start w:val="1"/>
+      <w:numFmt w:val="decimal"/>
+      <w:lvlText w:val="%1."/>
+      <w:lvlJc w:val="left"/>
+      <w:pPr>
+        <w:ind w:left="1080" w:hanging="360"/>
+      </w:pPr>
+      <w:rPr>
+        <w:rFonts w:hint="default"/>
+      </w:rPr>
+    </w:lvl>
+    <w:lvl w:ilvl="1" w:tplc="080A0019" w:tentative="1">
+      <w:start w:val="1"/>
+      <w:numFmt w:val="lowerLetter"/>
+      <w:lvlText w:val="%2."/>
+      <w:lvlJc w:val="left"/>
+      <w:pPr>
+        <w:ind w:left="1800" w:hanging="360"/>
+      </w:pPr>
+    </w:lvl>
+    <w:lvl w:ilvl="2" w:tplc="080A001B" w:tentative="1">
+      <w:start w:val="1"/>
+      <w:numFmt w:val="lowerRoman"/>
+      <w:lvlText w:val="%3."/>
+      <w:lvlJc w:val="right"/>
+      <w:pPr>
+        <w:ind w:left="2520" w:hanging="180"/>
+      </w:pPr>
+    </w:lvl>
+    <w:lvl w:ilvl="3" w:tplc="080A000F" w:tentative="1">
+      <w:start w:val="1"/>
+      <w:numFmt w:val="decimal"/>
+      <w:lvlText w:val="%4."/>
+      <w:lvlJc w:val="left"/>
+      <w:pPr>
+        <w:ind w:left="3240" w:hanging="360"/>
+      </w:pPr>
+    </w:lvl>
+    <w:lvl w:ilvl="4" w:tplc="080A0019" w:tentative="1">
+      <w:start w:val="1"/>
+      <w:numFmt w:val="lowerLetter"/>
+      <w:lvlText w:val="%5."/>
+      <w:lvlJc w:val="left"/>
+      <w:pPr>
+        <w:ind w:left="3960" w:hanging="360"/>
+      </w:pPr>
+    </w:lvl>
+    <w:lvl w:ilvl="5" w:tplc="080A001B" w:tentative="1">
+      <w:start w:val="1"/>
+      <w:numFmt w:val="lowerRoman"/>
+      <w:lvlText w:val="%6."/>
+      <w:lvlJc w:val="right"/>
+      <w:pPr>
+        <w:ind w:left="4680" w:hanging="180"/>
+      </w:pPr>
+    </w:lvl>
+    <w:lvl w:ilvl="6" w:tplc="080A000F" w:tentative="1">
+      <w:start w:val="1"/>
+      <w:numFmt w:val="decimal"/>
+      <w:lvlText w:val="%7."/>
+      <w:lvlJc w:val="left"/>
+      <w:pPr>
+        <w:ind w:left="5400" w:hanging="360"/>
+      </w:pPr>
+    </w:lvl>
+    <w:lvl w:ilvl="7" w:tplc="080A0019" w:tentative="1">
+      <w:start w:val="1"/>
+      <w:numFmt w:val="lowerLetter"/>
+      <w:lvlText w:val="%8."/>
+      <w:lvlJc w:val="left"/>
+      <w:pPr>
+        <w:ind w:left="6120" w:hanging="360"/>
+      </w:pPr>
+    </w:lvl>
+    <w:lvl w:ilvl="8" w:tplc="080A001B" w:tentative="1">
+      <w:start w:val="1"/>
+      <w:numFmt w:val="lowerRoman"/>
+      <w:lvlText w:val="%9."/>
+      <w:lvlJc w:val="right"/>
+      <w:pPr>
+        <w:ind w:left="6840" w:hanging="180"/>
+      </w:pPr>
+    </w:lvl>
+  </w:abstractNum>
+  <w:abstractNum w:abstractNumId="2" w15:restartNumberingAfterBreak="0">
     <w:nsid w:val="3EB155A9"/>
     <w:multiLevelType w:val="hybridMultilevel"/>
     <w:tmpl w:val="BC8271BA"/>
@@ -813,11 +1599,106 @@
       </w:pPr>
     </w:lvl>
   </w:abstractNum>
+  <w:abstractNum w:abstractNumId="3" w15:restartNumberingAfterBreak="0">
+    <w:nsid w:val="72DC4036"/>
+    <w:multiLevelType w:val="hybridMultilevel"/>
+    <w:tmpl w:val="F462D404"/>
+    <w:lvl w:ilvl="0" w:tplc="080A000F">
+      <w:start w:val="1"/>
+      <w:numFmt w:val="decimal"/>
+      <w:lvlText w:val="%1."/>
+      <w:lvlJc w:val="left"/>
+      <w:pPr>
+        <w:ind w:left="720" w:hanging="360"/>
+      </w:pPr>
+      <w:rPr>
+        <w:rFonts w:hint="default"/>
+      </w:rPr>
+    </w:lvl>
+    <w:lvl w:ilvl="1" w:tplc="080A0019" w:tentative="1">
+      <w:start w:val="1"/>
+      <w:numFmt w:val="lowerLetter"/>
+      <w:lvlText w:val="%2."/>
+      <w:lvlJc w:val="left"/>
+      <w:pPr>
+        <w:ind w:left="1440" w:hanging="360"/>
+      </w:pPr>
+    </w:lvl>
+    <w:lvl w:ilvl="2" w:tplc="080A001B" w:tentative="1">
+      <w:start w:val="1"/>
+      <w:numFmt w:val="lowerRoman"/>
+      <w:lvlText w:val="%3."/>
+      <w:lvlJc w:val="right"/>
+      <w:pPr>
+        <w:ind w:left="2160" w:hanging="180"/>
+      </w:pPr>
+    </w:lvl>
+    <w:lvl w:ilvl="3" w:tplc="080A000F" w:tentative="1">
+      <w:start w:val="1"/>
+      <w:numFmt w:val="decimal"/>
+      <w:lvlText w:val="%4."/>
+      <w:lvlJc w:val="left"/>
+      <w:pPr>
+        <w:ind w:left="2880" w:hanging="360"/>
+      </w:pPr>
+    </w:lvl>
+    <w:lvl w:ilvl="4" w:tplc="080A0019" w:tentative="1">
+      <w:start w:val="1"/>
+      <w:numFmt w:val="lowerLetter"/>
+      <w:lvlText w:val="%5."/>
+      <w:lvlJc w:val="left"/>
+      <w:pPr>
+        <w:ind w:left="3600" w:hanging="360"/>
+      </w:pPr>
+    </w:lvl>
+    <w:lvl w:ilvl="5" w:tplc="080A001B" w:tentative="1">
+      <w:start w:val="1"/>
+      <w:numFmt w:val="lowerRoman"/>
+      <w:lvlText w:val="%6."/>
+      <w:lvlJc w:val="right"/>
+      <w:pPr>
+        <w:ind w:left="4320" w:hanging="180"/>
+      </w:pPr>
+    </w:lvl>
+    <w:lvl w:ilvl="6" w:tplc="080A000F" w:tentative="1">
+      <w:start w:val="1"/>
+      <w:numFmt w:val="decimal"/>
+      <w:lvlText w:val="%7."/>
+      <w:lvlJc w:val="left"/>
+      <w:pPr>
+        <w:ind w:left="5040" w:hanging="360"/>
+      </w:pPr>
+    </w:lvl>
+    <w:lvl w:ilvl="7" w:tplc="080A0019" w:tentative="1">
+      <w:start w:val="1"/>
+      <w:numFmt w:val="lowerLetter"/>
+      <w:lvlText w:val="%8."/>
+      <w:lvlJc w:val="left"/>
+      <w:pPr>
+        <w:ind w:left="5760" w:hanging="360"/>
+      </w:pPr>
+    </w:lvl>
+    <w:lvl w:ilvl="8" w:tplc="080A001B" w:tentative="1">
+      <w:start w:val="1"/>
+      <w:numFmt w:val="lowerRoman"/>
+      <w:lvlText w:val="%9."/>
+      <w:lvlJc w:val="right"/>
+      <w:pPr>
+        <w:ind w:left="6480" w:hanging="180"/>
+      </w:pPr>
+    </w:lvl>
+  </w:abstractNum>
   <w:num w:numId="1" w16cid:durableId="1184245370">
-    <w:abstractNumId w:val="1"/>
+    <w:abstractNumId w:val="2"/>
   </w:num>
   <w:num w:numId="2" w16cid:durableId="1309285722">
     <w:abstractNumId w:val="0"/>
+  </w:num>
+  <w:num w:numId="3" w16cid:durableId="221261736">
+    <w:abstractNumId w:val="3"/>
+  </w:num>
+  <w:num w:numId="4" w16cid:durableId="986519230">
+    <w:abstractNumId w:val="1"/>
   </w:num>
 </w:numbering>
 </file>

</xml_diff>